<commit_message>
feat(portal): refine DOCX diagrams with zero text overlap, integrate web portal user guide & auto release notes modal v2026.8.8, and synchronize Excel export Navy design palette
</commit_message>
<xml_diff>
--- a/HUONG_DAN_SU_DUNG_WEB_PORTAL.docx
+++ b/HUONG_DAN_SU_DUNG_WEB_PORTAL.docx
@@ -845,7 +845,7 @@
       <w:r>
         <w:drawing>
           <wp:inline xmlns:a="http://schemas.openxmlformats.org/drawingml/2006/main" xmlns:pic="http://schemas.openxmlformats.org/drawingml/2006/picture">
-            <wp:extent cx="5486400" cy="2715491"/>
+            <wp:extent cx="5486400" cy="2718033"/>
             <wp:docPr id="2" name="Picture 2"/>
             <wp:cNvGraphicFramePr>
               <a:graphicFrameLocks noChangeAspect="1"/>
@@ -866,7 +866,7 @@
                   <pic:spPr>
                     <a:xfrm>
                       <a:off x="0" y="0"/>
-                      <a:ext cx="5486400" cy="2715491"/>
+                      <a:ext cx="5486400" cy="2718033"/>
                     </a:xfrm>
                     <a:prstGeom prst="rect"/>
                   </pic:spPr>
@@ -1221,7 +1221,7 @@
       <w:r>
         <w:drawing>
           <wp:inline xmlns:a="http://schemas.openxmlformats.org/drawingml/2006/main" xmlns:pic="http://schemas.openxmlformats.org/drawingml/2006/picture">
-            <wp:extent cx="5486400" cy="2097928"/>
+            <wp:extent cx="5486400" cy="2466363"/>
             <wp:docPr id="3" name="Picture 3"/>
             <wp:cNvGraphicFramePr>
               <a:graphicFrameLocks noChangeAspect="1"/>
@@ -1242,7 +1242,7 @@
                   <pic:spPr>
                     <a:xfrm>
                       <a:off x="0" y="0"/>
-                      <a:ext cx="5486400" cy="2097928"/>
+                      <a:ext cx="5486400" cy="2466363"/>
                     </a:xfrm>
                     <a:prstGeom prst="rect"/>
                   </pic:spPr>
@@ -1458,7 +1458,7 @@
       <w:r>
         <w:drawing>
           <wp:inline xmlns:a="http://schemas.openxmlformats.org/drawingml/2006/main" xmlns:pic="http://schemas.openxmlformats.org/drawingml/2006/picture">
-            <wp:extent cx="5486400" cy="2232911"/>
+            <wp:extent cx="5486400" cy="2567031"/>
             <wp:docPr id="4" name="Picture 4"/>
             <wp:cNvGraphicFramePr>
               <a:graphicFrameLocks noChangeAspect="1"/>
@@ -1479,7 +1479,7 @@
                   <pic:spPr>
                     <a:xfrm>
                       <a:off x="0" y="0"/>
-                      <a:ext cx="5486400" cy="2232911"/>
+                      <a:ext cx="5486400" cy="2567031"/>
                     </a:xfrm>
                     <a:prstGeom prst="rect"/>
                   </pic:spPr>
@@ -1749,7 +1749,7 @@
       <w:r>
         <w:drawing>
           <wp:inline xmlns:a="http://schemas.openxmlformats.org/drawingml/2006/main" xmlns:pic="http://schemas.openxmlformats.org/drawingml/2006/picture">
-            <wp:extent cx="5486400" cy="2222851"/>
+            <wp:extent cx="5486400" cy="2364018"/>
             <wp:docPr id="5" name="Picture 5"/>
             <wp:cNvGraphicFramePr>
               <a:graphicFrameLocks noChangeAspect="1"/>
@@ -1770,7 +1770,7 @@
                   <pic:spPr>
                     <a:xfrm>
                       <a:off x="0" y="0"/>
-                      <a:ext cx="5486400" cy="2222851"/>
+                      <a:ext cx="5486400" cy="2364018"/>
                     </a:xfrm>
                     <a:prstGeom prst="rect"/>
                   </pic:spPr>

</xml_diff>